<commit_message>
docs: actualizar informe Word e iconos
- Reemplazadas las 3 capturas del documento con el diseño
  Apple-crema actual (reproductor integrado, barra dorada)
- Texto actualizado: introducción, objetivos, componentes,
  flujo, descripción de capturas
- Iconos regenerados a 128x128 con formas vectoriales precisas
</commit_message>
<xml_diff>
--- a/docs/Informe_Proyecto_Chatbot_SBC.docx
+++ b/docs/Informe_Proyecto_Chatbot_SBC.docx
@@ -184,7 +184,7 @@
     </w:p>
     <w:p>
       <w:r>
-        <w:t>El presente documento describe el desarrollo de un Sistema Basado en Conocimiento (SBC) implementado como un chatbot interactivo para el diagnóstico de estrés y la prescripción personalizada de musicoterapia a través de Spotify. El sistema utiliza un motor de Máquina de Estados Finitos (FSM) con 29 nodos que guían al usuario a través de una entrevista estructurada para identificar su estado emocional y recomendar la terapia musical más adecuada.</w:t>
+        <w:t>El presente documento describe el desarrollo de un Sistema Basado en Conocimiento (SBC) implementado como un chatbot interactivo para el diagnóstico de estrés y la prescripción personalizada de musicoterapia a través de la API de Spotify.</w:t>
       </w:r>
     </w:p>
     <w:p>
@@ -194,7 +194,7 @@
     </w:p>
     <w:p>
       <w:r>
-        <w:t>La aplicación se despliega en dos interfaces: una aplicación de escritorio con CustomTkinter y un bot de Telegram, ambas compartiendo el mismo núcleo de conocimiento y lógica FSM.</w:t>
+        <w:t>La aplicación se despliega en dos interfaces: una aplicación de escritorio con CustomTkinter (estilo Apple-crema neoskeuomórfico, modo oscuro/claro, reproductor integrado con controles de playback) y un bot de Telegram con comandos /nowplaying y teclado de control remoto, ambas compartiendo el mismo núcleo FSM.</w:t>
       </w:r>
     </w:p>
     <w:p>
@@ -263,7 +263,7 @@
         <w:pStyle w:val="ListBullet"/>
       </w:pPr>
       <w:r>
-        <w:t>Conectar con la API de Spotify para buscar y reproducir playlists terapéuticas.</w:t>
+        <w:t>Conectar con la API de Spotify para buscar, recomendar y controlar la reproducción de playlists terapéuticas (play/pause, anterior/siguiente, volumen, shuffle, repetición).</w:t>
       </w:r>
     </w:p>
     <w:p>
@@ -271,7 +271,7 @@
         <w:pStyle w:val="ListBullet"/>
       </w:pPr>
       <w:r>
-        <w:t>Construir una interfaz gráfica de escritorio amigable con CustomTkinter.</w:t>
+        <w:t>Construir una interfaz gráfica de escritorio con CustomTkinter (tema claro/oscuro, reproductor integrado, animaciones, splash con gradiente y anillos).</w:t>
       </w:r>
     </w:p>
     <w:p>
@@ -279,7 +279,7 @@
         <w:pStyle w:val="ListBullet"/>
       </w:pPr>
       <w:r>
-        <w:t>Documentar todo el árbol de decisión con diagramas visuales.</w:t>
+        <w:t>Implementar un bot de Telegram con control remoto de reproducción y comandos de estado en vivo.</w:t>
       </w:r>
     </w:p>
     <w:p>
@@ -480,7 +480,7 @@
           </w:tcPr>
           <w:p>
             <w:r>
-              <w:t>Integración con API de Spotify para búsqueda y reproducción de playlists.</w:t>
+              <w:t>Integración con API de Spotify para búsqueda de playlists, control de playback (reproducir, pausar, saltar, volumen, shuffle, repetir) y obtención de carátulas</w:t>
             </w:r>
           </w:p>
         </w:tc>
@@ -502,7 +502,7 @@
           </w:tcPr>
           <w:p>
             <w:r>
-              <w:t>Interfaz gráfica con CustomTkinter (ventana 520x720).</w:t>
+              <w:t>Interfaz gráfica con CustomTkinter (tema Apple-crema, reproductor Spotify, modo oscuro, animación typing, splash con gradiente)</w:t>
             </w:r>
           </w:p>
         </w:tc>
@@ -524,7 +524,7 @@
           </w:tcPr>
           <w:p>
             <w:r>
-              <w:t>Interfaz para Telegram con manejo de comandos y conversaciones.</w:t>
+              <w:t>Interfaz para Telegram con comandos /nowplaying, teclado de control de reproducción, manejo de 9 callbacks de control</w:t>
             </w:r>
           </w:p>
         </w:tc>
@@ -620,11 +620,9 @@
         <w:rPr>
           <w:b/>
         </w:rPr>
-        <w:t xml:space="preserve">8. Reproducción: </w:t>
+        <w:t>8. Reproducción: El usuario puede abrir la playlist en Spotify, reproducirla directamente desde la app con el reproductor integrado (con barra de progreso, portada y controles), o controlarla remotamente desde Telegram con /nowplaying.</w:t>
       </w:r>
-      <w:r>
-        <w:t>El usuario puede abrir la playlist en Spotify o reproducirla directamente.</w:t>
-      </w:r>
+      <w:r/>
     </w:p>
     <w:p>
       <w:pPr>
@@ -5116,7 +5114,7 @@
     </w:p>
     <w:p>
       <w:r>
-        <w:t>La ventana principal muestra el mensaje de bienvenida del chatbot, la primera pregunta con tres opciones en forma de botones, y el campo de entrada de texto libre en la parte inferior.</w:t>
+        <w:t>Pantalla de inicio con el diseño Apple-crema (fondo #F5F0EB, tarjetas blancas, acentos dorados #D4933A). El chatbot saluda con un mensaje aleatorio y presenta la primera pregunta con tres botones de opción (Físico, Mental, Emocional). La barra superior muestra el logo, el título, el botón de conexión a Spotify, el botón de Nuevo diagnóstico y el botón de cambio de tema (oscuro/claro).</w:t>
       </w:r>
     </w:p>
     <w:p>
@@ -5168,7 +5166,7 @@
     </w:p>
     <w:p>
       <w:r>
-        <w:t>Durante la conversación, el usuario responde a las preguntas del bot mediante opciones o texto libre. Al llegar a un nodo hoja, se muestra el diagnóstico con la recomendación terapéutica y el nombre de la playlist recomendada.</w:t>
+        <w:t>Captura de una conversación activa donde se alternan burbujas del bot (blancas con borde, alineadas a la izquierda) y del usuario (doradas, alineadas a la derecha). Se aprecia el efecto de escritura simulada y las preguntas con botones de opción. El árbol de 29 nodos guía la conversación hasta llegar a un diagnóstico.</w:t>
       </w:r>
     </w:p>
     <w:p>
@@ -5220,7 +5218,7 @@
     </w:p>
     <w:p>
       <w:r>
-        <w:t>Una vez completado el diagnóstico, la aplicación se conecta a la API de Spotify para buscar la playlist recomendada. El usuario puede abrir la playlist en el navegador o reproducirla directamente si está autenticado con una cuenta Premium.</w:t>
+        <w:t>Pantalla de resultado que muestra el diagnóstico (p. ej. "Agotamiento Crónico con Desconexión Profunda"), la playlist recomendada, el reproductor integrado con portada del álbum, barra de progreso dorada y controles (play/pause, anterior, siguiente), y los botones de acción: "Abrir en Spotify", "Reproducir ahora" y "Nuevo diagnóstico".</w:t>
       </w:r>
     </w:p>
     <w:p>

</xml_diff>

<commit_message>
Revert redesign - restore gold palette, PNG icons, textbox chat bubbles
</commit_message>
<xml_diff>
--- a/docs/Informe_Proyecto_Chatbot_SBC.docx
+++ b/docs/Informe_Proyecto_Chatbot_SBC.docx
@@ -184,7 +184,7 @@
     </w:p>
     <w:p>
       <w:r>
-        <w:t>El presente documento describe el desarrollo de un Sistema Basado en Conocimiento (SBC) implementado como un chatbot interactivo para el diagnóstico de estrés y la prescripción personalizada de musicoterapia a través de la API de Spotify.</w:t>
+        <w:t>El presente documento describe el desarrollo de un Sistema Basado en Conocimiento (SBC) implementado como un chatbot interactivo para el diagnóstico de estrés y la prescripción personalizada de musicoterapia a través de Spotify. El sistema utiliza un motor de Máquina de Estados Finitos (FSM) con 29 nodos que guían al usuario a través de una entrevista estructurada para identificar su estado emocional y recomendar la terapia musical más adecuada.</w:t>
       </w:r>
     </w:p>
     <w:p>
@@ -194,7 +194,7 @@
     </w:p>
     <w:p>
       <w:r>
-        <w:t>La aplicación se despliega en dos interfaces: una aplicación de escritorio con CustomTkinter (estilo Apple-crema neoskeuomórfico, modo oscuro/claro, reproductor integrado con controles de playback) y un bot de Telegram con comandos /nowplaying y teclado de control remoto, ambas compartiendo el mismo núcleo FSM.</w:t>
+        <w:t>La aplicación se despliega en dos interfaces: una aplicación de escritorio con CustomTkinter y un bot de Telegram, ambas compartiendo el mismo núcleo de conocimiento y lógica FSM.</w:t>
       </w:r>
     </w:p>
     <w:p>
@@ -263,7 +263,7 @@
         <w:pStyle w:val="ListBullet"/>
       </w:pPr>
       <w:r>
-        <w:t>Conectar con la API de Spotify para buscar, recomendar y controlar la reproducción de playlists terapéuticas (play/pause, anterior/siguiente, volumen, shuffle, repetición).</w:t>
+        <w:t>Conectar con la API de Spotify para buscar y reproducir playlists terapéuticas.</w:t>
       </w:r>
     </w:p>
     <w:p>
@@ -271,7 +271,7 @@
         <w:pStyle w:val="ListBullet"/>
       </w:pPr>
       <w:r>
-        <w:t>Construir una interfaz gráfica de escritorio con CustomTkinter (tema claro/oscuro, reproductor integrado, animaciones, splash con gradiente y anillos).</w:t>
+        <w:t>Construir una interfaz gráfica de escritorio amigable con CustomTkinter.</w:t>
       </w:r>
     </w:p>
     <w:p>
@@ -279,7 +279,7 @@
         <w:pStyle w:val="ListBullet"/>
       </w:pPr>
       <w:r>
-        <w:t>Implementar un bot de Telegram con control remoto de reproducción y comandos de estado en vivo.</w:t>
+        <w:t>Documentar todo el árbol de decisión con diagramas visuales.</w:t>
       </w:r>
     </w:p>
     <w:p>
@@ -480,7 +480,7 @@
           </w:tcPr>
           <w:p>
             <w:r>
-              <w:t>Integración con API de Spotify para búsqueda de playlists, control de playback (reproducir, pausar, saltar, volumen, shuffle, repetir) y obtención de carátulas</w:t>
+              <w:t>Integración con API de Spotify para búsqueda y reproducción de playlists.</w:t>
             </w:r>
           </w:p>
         </w:tc>
@@ -502,7 +502,7 @@
           </w:tcPr>
           <w:p>
             <w:r>
-              <w:t>Interfaz gráfica con CustomTkinter (tema Apple-crema, reproductor Spotify, modo oscuro, animación typing, splash con gradiente)</w:t>
+              <w:t>Interfaz gráfica con CustomTkinter (ventana 520x720).</w:t>
             </w:r>
           </w:p>
         </w:tc>
@@ -524,7 +524,7 @@
           </w:tcPr>
           <w:p>
             <w:r>
-              <w:t>Interfaz para Telegram con comandos /nowplaying, teclado de control de reproducción, manejo de 9 callbacks de control</w:t>
+              <w:t>Interfaz para Telegram con manejo de comandos y conversaciones.</w:t>
             </w:r>
           </w:p>
         </w:tc>
@@ -620,9 +620,11 @@
         <w:rPr>
           <w:b/>
         </w:rPr>
-        <w:t>8. Reproducción: El usuario puede abrir la playlist en Spotify, reproducirla directamente desde la app con el reproductor integrado (con barra de progreso, portada y controles), o controlarla remotamente desde Telegram con /nowplaying.</w:t>
+        <w:t xml:space="preserve">8. Reproducción: </w:t>
       </w:r>
-      <w:r/>
+      <w:r>
+        <w:t>El usuario puede abrir la playlist en Spotify o reproducirla directamente.</w:t>
+      </w:r>
     </w:p>
     <w:p>
       <w:pPr>
@@ -5114,7 +5116,7 @@
     </w:p>
     <w:p>
       <w:r>
-        <w:t>Pantalla de inicio con el diseño Apple-crema (fondo #F5F0EB, tarjetas blancas, acentos dorados #D4933A). El chatbot saluda con un mensaje aleatorio y presenta la primera pregunta con tres botones de opción (Físico, Mental, Emocional). La barra superior muestra el logo, el título, el botón de conexión a Spotify, el botón de Nuevo diagnóstico y el botón de cambio de tema (oscuro/claro).</w:t>
+        <w:t>La ventana principal muestra el mensaje de bienvenida del chatbot, la primera pregunta con tres opciones en forma de botones, y el campo de entrada de texto libre en la parte inferior.</w:t>
       </w:r>
     </w:p>
     <w:p>
@@ -5166,7 +5168,7 @@
     </w:p>
     <w:p>
       <w:r>
-        <w:t>Captura de una conversación activa donde se alternan burbujas del bot (blancas con borde, alineadas a la izquierda) y del usuario (doradas, alineadas a la derecha). Se aprecia el efecto de escritura simulada y las preguntas con botones de opción. El árbol de 29 nodos guía la conversación hasta llegar a un diagnóstico.</w:t>
+        <w:t>Durante la conversación, el usuario responde a las preguntas del bot mediante opciones o texto libre. Al llegar a un nodo hoja, se muestra el diagnóstico con la recomendación terapéutica y el nombre de la playlist recomendada.</w:t>
       </w:r>
     </w:p>
     <w:p>
@@ -5218,7 +5220,7 @@
     </w:p>
     <w:p>
       <w:r>
-        <w:t>Pantalla de resultado que muestra el diagnóstico (p. ej. "Agotamiento Crónico con Desconexión Profunda"), la playlist recomendada, el reproductor integrado con portada del álbum, barra de progreso dorada y controles (play/pause, anterior, siguiente), y los botones de acción: "Abrir en Spotify", "Reproducir ahora" y "Nuevo diagnóstico".</w:t>
+        <w:t>Una vez completado el diagnóstico, la aplicación se conecta a la API de Spotify para buscar la playlist recomendada. El usuario puede abrir la playlist en el navegador o reproducirla directamente si está autenticado con una cuenta Premium.</w:t>
       </w:r>
     </w:p>
     <w:p>

</xml_diff>